<commit_message>
Build complete AI Tutor learning engine with interactive chat, quizzes, flashcards, audio lessons, and improved teaching prompts
</commit_message>
<xml_diff>
--- a/static/downloads/Adetola Olumide_ACTIVE VOICE-GCSE QUESTIONS.pdf_AI_Study_Notes.docx
+++ b/static/downloads/Adetola Olumide_ACTIVE VOICE-GCSE QUESTIONS.pdf_AI_Study_Notes.docx
@@ -91,91 +91,69 @@
     </w:p>
     <w:p>
       <w:r>
-        <w:t>Let’s work through this together—English grammar is like a toolkit to build clear and interesting sentences. Once you understand some core ideas, everything else starts to click into place.</w:t>
+        <w:t>Alright, let’s dive into this English grammar exam together! At first glance, grammar might seem like a bunch of rules to memorize, but what really helps is understanding how sentences work and how their parts come together. If we get the basics clear, everything else falls into place much easier. Sound good?</w:t>
         <w:br/>
         <w:br/>
         <w:t>---</w:t>
         <w:br/>
         <w:br/>
-        <w:t>### 💡 Active and Passive Voice — What’s the Big Idea?</w:t>
+        <w:t>### 💡 The Big Idea: Active vs Passive Voice</w:t>
         <w:br/>
         <w:br/>
-        <w:t>Active voice is when the subject of the sentence is *doing* the action. For example: "The author wrote the book." Here, **the author** is the one acting.</w:t>
+        <w:t xml:space="preserve">Let's start with something you saw in Question 1—active and passive voice. </w:t>
         <w:br/>
         <w:br/>
-        <w:t>Passive voice flips this around: the subject receives the action. Like, "The book was written by the author." Now, the **book** is not doing anything; it’s just being acted upon.</w:t>
+        <w:t>**Active voice** happens when the subject of the sentence is *doing* the action. So if "The author wrote the book," the author is doing the writing.</w:t>
         <w:br/>
         <w:br/>
-        <w:t>Understanding this difference helps you spot who’s doing what in a sentence, which makes your writing clearer.</w:t>
+        <w:t>**Passive voice** flips this around: the subject is *receiving* the action. So if the sentence says "The book was written by the author," the book isn’t doing anything; it’s receiving the action of being written.</w:t>
         <w:br/>
         <w:br/>
-        <w:t>Don’t worry if this feels tricky at first—it becomes much easier after a few examples.</w:t>
+        <w:t>Don't worry if this seems tricky; once you practice spotting who’s doing what in the sentence, it becomes easier.</w:t>
         <w:br/>
         <w:br/>
         <w:t>---</w:t>
         <w:br/>
         <w:br/>
-        <w:t>### 🌍 Making Active vs. Passive Voice Real</w:t>
+        <w:t>### 🌍 Making Voice Real</w:t>
         <w:br/>
         <w:br/>
-        <w:t>Imagine you’re at a party and you say, "I ate the cake." You’re actively saying what *you* did.</w:t>
-        <w:br/>
-        <w:br/>
-        <w:t>If you say, "The cake was eaten," you’re focusing on the cake, but not on who ate it.</w:t>
-        <w:br/>
-        <w:br/>
-        <w:t>This is like telling a story from different points of view: Are you talking about the doer or the receiver?</w:t>
+        <w:t>Imagine you’re at a football game. If you say, “The striker kicked the ball,” that’s active—striker is doing the kicking. But if you say, “The ball was kicked by the striker,” that’s passive—the ball is just receiving the kick.</w:t>
         <w:br/>
         <w:br/>
         <w:t>---</w:t>
         <w:br/>
         <w:br/>
-        <w:t>### 🤔 Pause and Think</w:t>
+        <w:t>### 🤔 Pause &amp; Think</w:t>
         <w:br/>
         <w:br/>
-        <w:t>Here’s a quick question: If you hear a sentence that starts with “The homework was...” is it more likely active or passive voice?</w:t>
+        <w:t>Why do you think someone might choose passive voice instead of active voice?</w:t>
         <w:br/>
         <w:br/>
         <w:t>---</w:t>
         <w:br/>
         <w:br/>
-        <w:t>### ✅ Continue Teaching</w:t>
+        <w:t>### ✅ Keep Going</w:t>
         <w:br/>
         <w:br/>
-        <w:t>If you said passive voice, you’re on the right track! Sentences starting with "The homework was..." usually mean the homework is *receiving* the action — that’s passive.</w:t>
-        <w:br/>
-        <w:br/>
-        <w:t>Remember: Active = subject does the action, passive = subject receives the action.</w:t>
+        <w:t>If you thought maybe because passive voice focuses on the thing *receiving* the action, exactly! Like when the focus is on “the book” or “the ball” instead of the person doing it. Sometimes it’s more important to highlight the action's recipient.</w:t>
         <w:br/>
         <w:br/>
         <w:t>---</w:t>
         <w:br/>
         <w:br/>
-        <w:t>### 💡 One Worked Example: Changing Active to Passive</w:t>
+        <w:t>### 💡 One Worked Example - Subject-Verb Agreement (Question 7)</w:t>
         <w:br/>
         <w:br/>
-        <w:t>Take this active sentence: "The teacher marked the exams."</w:t>
+        <w:t>Take: “The students were happy.” Why is it “were” and not “was”?</w:t>
         <w:br/>
         <w:br/>
-        <w:t>Step 1: Find the object—*the exams*.</w:t>
+        <w:t>- “Students” is plural (more than one).</w:t>
+        <w:br/>
+        <w:t>- The verb needs to agree, so instead of singular “was” for one student, we say “were” for many students.</w:t>
         <w:br/>
         <w:br/>
-        <w:t>Step 2: Move it to the beginning: "The exams..."</w:t>
-        <w:br/>
-        <w:br/>
-        <w:t>Step 3: Use the correct form of "to be" + past participle of the verb. Here, "was/were marked."</w:t>
-        <w:br/>
-        <w:br/>
-        <w:t>Since "exams" is plural, use "were."</w:t>
-        <w:br/>
-        <w:br/>
-        <w:t>Step 4: Add "by the teacher" (the original subject) at the end.</w:t>
-        <w:br/>
-        <w:br/>
-        <w:t>Final passive sentence: "The exams were marked by the teacher."</w:t>
-        <w:br/>
-        <w:br/>
-        <w:t>Notice how the focus shifts from *who* did the action to *what* received it.</w:t>
+        <w:t>If you say “The students was happy,” it sounds off because the verb doesn’t match the subject number.</w:t>
         <w:br/>
         <w:br/>
         <w:t>---</w:t>
@@ -184,13 +162,15 @@
         <w:t>### ⚠ Where Students Usually Get Stuck</w:t>
         <w:br/>
         <w:br/>
-        <w:t>A common mistake is forgetting to change the verb properly when switching to passive. People might say, "The exams was marked," which is wrong because "exams" is plural and needs "were."</w:t>
+        <w:t xml:space="preserve">People often confuse words like “its” and “it’s” (Question 2). </w:t>
         <w:br/>
         <w:br/>
-        <w:t>Tip: Always check if the subject is singular or plural to match the verb correctly.</w:t>
+        <w:t>- “Its” shows possession, like “The dog wagged its tail.”</w:t>
+        <w:br/>
+        <w:t>- “It’s” is a contraction for “it is.”</w:t>
         <w:br/>
         <w:br/>
-        <w:t>Another mix-up is forgetting "by" when mentioning the doer in passive voice.</w:t>
+        <w:t>A simple trick: replace “it’s” with “it is” in the sentence. If it fits, use “it’s.” Otherwise, use “its.”</w:t>
         <w:br/>
         <w:br/>
         <w:t>---</w:t>
@@ -199,16 +179,26 @@
         <w:t>### 🎯 Your Turn</w:t>
         <w:br/>
         <w:br/>
-        <w:t>Try this: Change "The chef prepared the meal" into passive voice. Think about the object, the verb form, and the doer.</w:t>
+        <w:t xml:space="preserve">Try this: Which sentence is in passive voice?  </w:t>
+        <w:br/>
+        <w:t xml:space="preserve">A. The dog chased the cat.  </w:t>
+        <w:br/>
+        <w:t xml:space="preserve">B. The cat was chased by the dog.  </w:t>
+        <w:br/>
+        <w:br/>
+        <w:t>Think about what’s doing the action and what’s receiving it before you decide.</w:t>
         <w:br/>
         <w:br/>
         <w:t>---</w:t>
         <w:br/>
         <w:br/>
-        <w:t>### 🚀 Finish Like a Tutor</w:t>
+        <w:t>### 🚀 You’re Doing Great!</w:t>
         <w:br/>
         <w:br/>
-        <w:t>Once you’re comfortable with active and passive voices, you’ll find spotting subjects and verbs much easier in any sentence. Let’s see how you do with the challenge!</w:t>
+        <w:t>Keep practicing these kinds of questions. Once you’re comfortable spotting active/passive voice and matching subjects and verbs, the rest will feel a lot easier. When you’re ready, try rewriting some sentences from Section B out loud—that really helps!</w:t>
+        <w:br/>
+        <w:br/>
+        <w:t>I think you’re ready for the next challenge. Let me know what part you want to tackle next!</w:t>
       </w:r>
     </w:p>
     <w:p>

</xml_diff>